<commit_message>
Move signed-in user display to the sidebar
</commit_message>
<xml_diff>
--- a/doc/🚀 Business Process.docx
+++ b/doc/🚀 Business Process.docx
@@ -5,6 +5,152 @@
     <w:p>
       <w:pPr>
         <w:rPr>
+          <w:rFonts w:ascii="Segoe UI Emoji" w:hAnsi="Segoe UI Emoji" w:cs="Segoe UI Emoji"/>
+          <w:b/>
+          <w:bCs/>
+        </w:rPr>
+      </w:pPr>
+    </w:p>
+    <w:p>
+      <w:pPr>
+        <w:rPr>
+          <w:b/>
+          <w:bCs/>
+          <w:sz w:val="36"/>
+          <w:szCs w:val="36"/>
+          <w:lang w:val="en-US"/>
+        </w:rPr>
+      </w:pPr>
+      <w:r>
+        <w:rPr>
+          <w:b/>
+          <w:bCs/>
+          <w:sz w:val="36"/>
+          <w:szCs w:val="36"/>
+          <w:lang w:val="en-US"/>
+        </w:rPr>
+        <w:t xml:space="preserve">Project Documentation for AI-Powered </w:t>
+      </w:r>
+      <w:r>
+        <w:rPr>
+          <w:b/>
+          <w:bCs/>
+          <w:sz w:val="36"/>
+          <w:szCs w:val="36"/>
+          <w:lang w:val="en-US"/>
+        </w:rPr>
+        <w:t>Research AI Platform</w:t>
+      </w:r>
+    </w:p>
+    <w:p>
+      <w:pPr>
+        <w:rPr>
+          <w:b/>
+          <w:bCs/>
+          <w:sz w:val="36"/>
+          <w:szCs w:val="36"/>
+          <w:lang w:val="en-US"/>
+        </w:rPr>
+      </w:pPr>
+      <w:r>
+        <w:rPr>
+          <w:b/>
+          <w:bCs/>
+          <w:sz w:val="36"/>
+          <w:szCs w:val="36"/>
+          <w:lang w:val="en-US"/>
+        </w:rPr>
+        <w:t xml:space="preserve">1. Business Scenario Document </w:t>
+      </w:r>
+    </w:p>
+    <w:p>
+      <w:pPr>
+        <w:rPr>
+          <w:b/>
+          <w:bCs/>
+          <w:sz w:val="36"/>
+          <w:szCs w:val="36"/>
+          <w:lang w:val="en-US"/>
+        </w:rPr>
+      </w:pPr>
+      <w:r>
+        <w:rPr>
+          <w:b/>
+          <w:bCs/>
+          <w:sz w:val="36"/>
+          <w:szCs w:val="36"/>
+          <w:lang w:val="en-US"/>
+        </w:rPr>
+        <w:t xml:space="preserve">1.1. Project Title: AI-Powered Legal Assistant </w:t>
+      </w:r>
+    </w:p>
+    <w:p>
+      <w:pPr>
+        <w:rPr>
+          <w:b/>
+          <w:bCs/>
+          <w:sz w:val="36"/>
+          <w:szCs w:val="36"/>
+          <w:lang w:val="en-US"/>
+        </w:rPr>
+      </w:pPr>
+      <w:r>
+        <w:rPr>
+          <w:b/>
+          <w:bCs/>
+          <w:sz w:val="36"/>
+          <w:szCs w:val="36"/>
+          <w:lang w:val="en-US"/>
+        </w:rPr>
+        <w:t>1.2. Business Need:</w:t>
+      </w:r>
+    </w:p>
+    <w:p>
+      <w:pPr>
+        <w:rPr>
+          <w:lang w:val="en-US"/>
+        </w:rPr>
+      </w:pPr>
+      <w:r>
+        <w:rPr>
+          <w:lang w:val="en-US"/>
+        </w:rPr>
+        <w:t>Academic researchers spend an estimated 60–70% of their time on literature reading and synthesis before generating any original output. Existing tools (Zotero, Mendeley) handle citation management but provide zero intelligence layer. General-purpose LLMs produce unstructured summaries with no domain awareness — they cannot distinguish a study's methodology from its findings, track contradictions across papers, or identify research gaps. ResearchLens solves this by building a structured extraction and reasoning layer on top of a RAG pipeline, purpose-built for academic document workflows.</w:t>
+      </w:r>
+    </w:p>
+    <w:p>
+      <w:pPr>
+        <w:rPr>
+          <w:lang w:val="en-US"/>
+        </w:rPr>
+      </w:pPr>
+      <w:r>
+        <w:rPr>
+          <w:b/>
+          <w:bCs/>
+          <w:sz w:val="36"/>
+          <w:szCs w:val="36"/>
+          <w:lang w:val="en-US"/>
+        </w:rPr>
+        <w:t>1.3. Business Opportunity</w:t>
+      </w:r>
+      <w:r>
+        <w:rPr>
+          <w:lang w:val="en-US"/>
+        </w:rPr>
+        <w:t>:</w:t>
+      </w:r>
+    </w:p>
+    <w:p>
+      <w:pPr>
+        <w:rPr>
+          <w:lang w:val="en-US"/>
+        </w:rPr>
+      </w:pPr>
+    </w:p>
+    <w:p>
+      <w:pPr>
+        <w:rPr>
           <w:b/>
           <w:bCs/>
           <w:lang w:val="en-US"/>
@@ -163,7 +309,7 @@
     <w:p>
       <w:r>
         <w:pict w14:anchorId="423E3181">
-          <v:rect id="_x0000_i1091" style="width:0;height:1.5pt" o:hralign="center" o:hrstd="t" o:hr="t" fillcolor="#a0a0a0" stroked="f"/>
+          <v:rect id="_x0000_i1025" style="width:0;height:1.5pt" o:hralign="center" o:hrstd="t" o:hr="t" fillcolor="#a0a0a0" stroked="f"/>
         </w:pict>
       </w:r>
     </w:p>
@@ -244,6 +390,7 @@
           <w:b/>
           <w:bCs/>
         </w:rPr>
+        <w:lastRenderedPageBreak/>
         <w:t>Process:</w:t>
       </w:r>
     </w:p>
@@ -331,7 +478,7 @@
     <w:p>
       <w:r>
         <w:pict w14:anchorId="66FE0837">
-          <v:rect id="_x0000_i1092" style="width:0;height:1.5pt" o:hralign="center" o:hrstd="t" o:hr="t" fillcolor="#a0a0a0" stroked="f"/>
+          <v:rect id="_x0000_i1026" style="width:0;height:1.5pt" o:hralign="center" o:hrstd="t" o:hr="t" fillcolor="#a0a0a0" stroked="f"/>
         </w:pict>
       </w:r>
     </w:p>
@@ -409,7 +556,6 @@
         </w:numPr>
       </w:pPr>
       <w:r>
-        <w:lastRenderedPageBreak/>
         <w:t xml:space="preserve">Document parsing (PDF → text) </w:t>
       </w:r>
     </w:p>
@@ -484,7 +630,7 @@
     <w:p>
       <w:r>
         <w:pict w14:anchorId="3A8E0477">
-          <v:rect id="_x0000_i1093" style="width:0;height:1.5pt" o:hralign="center" o:hrstd="t" o:hr="t" fillcolor="#a0a0a0" stroked="f"/>
+          <v:rect id="_x0000_i1027" style="width:0;height:1.5pt" o:hralign="center" o:hrstd="t" o:hr="t" fillcolor="#a0a0a0" stroked="f"/>
         </w:pict>
       </w:r>
     </w:p>
@@ -613,13 +759,14 @@
         </w:numPr>
       </w:pPr>
       <w:r>
+        <w:lastRenderedPageBreak/>
         <w:t xml:space="preserve">Faster retrieval of relevant context </w:t>
       </w:r>
     </w:p>
     <w:p>
       <w:r>
         <w:pict w14:anchorId="754E24F1">
-          <v:rect id="_x0000_i1094" style="width:0;height:1.5pt" o:hralign="center" o:hrstd="t" o:hr="t" fillcolor="#a0a0a0" stroked="f"/>
+          <v:rect id="_x0000_i1028" style="width:0;height:1.5pt" o:hralign="center" o:hrstd="t" o:hr="t" fillcolor="#a0a0a0" stroked="f"/>
         </w:pict>
       </w:r>
     </w:p>
@@ -775,7 +922,7 @@
     <w:p>
       <w:r>
         <w:pict w14:anchorId="51EC17FA">
-          <v:rect id="_x0000_i1095" style="width:0;height:1.5pt" o:hralign="center" o:hrstd="t" o:hr="t" fillcolor="#a0a0a0" stroked="f"/>
+          <v:rect id="_x0000_i1029" style="width:0;height:1.5pt" o:hralign="center" o:hrstd="t" o:hr="t" fillcolor="#a0a0a0" stroked="f"/>
         </w:pict>
       </w:r>
     </w:p>
@@ -793,7 +940,6 @@
           <w:b/>
           <w:bCs/>
         </w:rPr>
-        <w:lastRenderedPageBreak/>
         <w:t>🤖</w:t>
       </w:r>
       <w:r>
@@ -968,7 +1114,7 @@
     <w:p>
       <w:r>
         <w:pict w14:anchorId="6960B759">
-          <v:rect id="_x0000_i1096" style="width:0;height:1.5pt" o:hralign="center" o:hrstd="t" o:hr="t" fillcolor="#a0a0a0" stroked="f"/>
+          <v:rect id="_x0000_i1030" style="width:0;height:1.5pt" o:hralign="center" o:hrstd="t" o:hr="t" fillcolor="#a0a0a0" stroked="f"/>
         </w:pict>
       </w:r>
     </w:p>
@@ -1009,6 +1155,7 @@
           <w:bCs/>
           <w:lang w:val="en-US"/>
         </w:rPr>
+        <w:lastRenderedPageBreak/>
         <w:t>Actor:</w:t>
       </w:r>
       <w:r>
@@ -1094,7 +1241,7 @@
     <w:p>
       <w:r>
         <w:pict w14:anchorId="3E66AFE4">
-          <v:rect id="_x0000_i1097" style="width:0;height:1.5pt" o:hralign="center" o:hrstd="t" o:hr="t" fillcolor="#a0a0a0" stroked="f"/>
+          <v:rect id="_x0000_i1031" style="width:0;height:1.5pt" o:hralign="center" o:hrstd="t" o:hr="t" fillcolor="#a0a0a0" stroked="f"/>
         </w:pict>
       </w:r>
     </w:p>
@@ -1163,7 +1310,6 @@
         </w:numPr>
       </w:pPr>
       <w:r>
-        <w:lastRenderedPageBreak/>
         <w:t xml:space="preserve">Query history </w:t>
       </w:r>
     </w:p>
@@ -1212,7 +1358,7 @@
     <w:p>
       <w:r>
         <w:pict w14:anchorId="0476A083">
-          <v:rect id="_x0000_i1098" style="width:0;height:1.5pt" o:hralign="center" o:hrstd="t" o:hr="t" fillcolor="#a0a0a0" stroked="f"/>
+          <v:rect id="_x0000_i1032" style="width:0;height:1.5pt" o:hralign="center" o:hrstd="t" o:hr="t" fillcolor="#a0a0a0" stroked="f"/>
         </w:pict>
       </w:r>
     </w:p>
@@ -1333,8 +1479,9 @@
     </w:p>
     <w:p>
       <w:r>
+        <w:lastRenderedPageBreak/>
         <w:pict w14:anchorId="55F87D88">
-          <v:rect id="_x0000_i1099" style="width:0;height:1.5pt" o:hralign="center" o:hrstd="t" o:hr="t" fillcolor="#a0a0a0" stroked="f"/>
+          <v:rect id="_x0000_i1033" style="width:0;height:1.5pt" o:hralign="center" o:hrstd="t" o:hr="t" fillcolor="#a0a0a0" stroked="f"/>
         </w:pict>
       </w:r>
     </w:p>
@@ -1463,7 +1610,7 @@
     <w:p>
       <w:r>
         <w:pict w14:anchorId="38F4B03C">
-          <v:rect id="_x0000_i1100" style="width:0;height:1.5pt" o:hralign="center" o:hrstd="t" o:hr="t" fillcolor="#a0a0a0" stroked="f"/>
+          <v:rect id="_x0000_i1034" style="width:0;height:1.5pt" o:hralign="center" o:hrstd="t" o:hr="t" fillcolor="#a0a0a0" stroked="f"/>
         </w:pict>
       </w:r>
     </w:p>
@@ -1472,6 +1619,7 @@
         <w:rPr>
           <w:b/>
           <w:bCs/>
+          <w:lang w:val="en-US"/>
         </w:rPr>
       </w:pPr>
       <w:r>
@@ -1486,6 +1634,7 @@
         <w:rPr>
           <w:b/>
           <w:bCs/>
+          <w:lang w:val="en-US"/>
         </w:rPr>
         <w:t xml:space="preserve"> Business Use Cases</w:t>
       </w:r>
@@ -1500,7 +1649,6 @@
         <w:rPr>
           <w:lang w:val="en-US"/>
         </w:rPr>
-        <w:lastRenderedPageBreak/>
         <w:t>Your platform can be positioned for:</w:t>
       </w:r>
     </w:p>
@@ -1682,7 +1830,7 @@
     <w:p>
       <w:r>
         <w:pict w14:anchorId="1E19C1DE">
-          <v:rect id="_x0000_i1101" style="width:0;height:1.5pt" o:hralign="center" o:hrstd="t" o:hr="t" fillcolor="#a0a0a0" stroked="f"/>
+          <v:rect id="_x0000_i1035" style="width:0;height:1.5pt" o:hralign="center" o:hrstd="t" o:hr="t" fillcolor="#a0a0a0" stroked="f"/>
         </w:pict>
       </w:r>
     </w:p>
@@ -1724,6 +1872,7 @@
           <w:rFonts w:ascii="Segoe UI Emoji" w:hAnsi="Segoe UI Emoji" w:cs="Segoe UI Emoji"/>
           <w:lang w:val="en-US"/>
         </w:rPr>
+        <w:lastRenderedPageBreak/>
         <w:t>⚡</w:t>
       </w:r>
       <w:r>
@@ -1808,6 +1957,46 @@
           <w:lang w:val="en-US"/>
         </w:rPr>
       </w:pPr>
+      <w:r>
+        <w:rPr>
+          <w:lang w:val="en-US"/>
+        </w:rPr>
+        <w:drawing>
+          <wp:inline distT="0" distB="0" distL="0" distR="0" wp14:anchorId="2128156A" wp14:editId="0CBF6A56">
+            <wp:extent cx="5731510" cy="5731510"/>
+            <wp:effectExtent l="0" t="0" r="0" b="0"/>
+            <wp:docPr id="1396821906" name="Picture 1"/>
+            <wp:cNvGraphicFramePr>
+              <a:graphicFrameLocks xmlns:a="http://schemas.openxmlformats.org/drawingml/2006/main" noChangeAspect="1"/>
+            </wp:cNvGraphicFramePr>
+            <a:graphic xmlns:a="http://schemas.openxmlformats.org/drawingml/2006/main">
+              <a:graphicData uri="http://schemas.openxmlformats.org/drawingml/2006/picture">
+                <pic:pic xmlns:pic="http://schemas.openxmlformats.org/drawingml/2006/picture">
+                  <pic:nvPicPr>
+                    <pic:cNvPr id="1396821906" name=""/>
+                    <pic:cNvPicPr/>
+                  </pic:nvPicPr>
+                  <pic:blipFill>
+                    <a:blip r:embed="rId5"/>
+                    <a:stretch>
+                      <a:fillRect/>
+                    </a:stretch>
+                  </pic:blipFill>
+                  <pic:spPr>
+                    <a:xfrm>
+                      <a:off x="0" y="0"/>
+                      <a:ext cx="5731510" cy="5731510"/>
+                    </a:xfrm>
+                    <a:prstGeom prst="rect">
+                      <a:avLst/>
+                    </a:prstGeom>
+                  </pic:spPr>
+                </pic:pic>
+              </a:graphicData>
+            </a:graphic>
+          </wp:inline>
+        </w:drawing>
+      </w:r>
     </w:p>
     <w:sectPr>
       <w:pgSz w:w="11906" w:h="16838"/>

</xml_diff>